<commit_message>
fix(cession): compromis dentaire — variable taux + duree du pret (retour Rafael)
Le modele source du compromis dentaire avait un trou fige (« au taux maximum
de ___ l'an », aucune variable) la ou le compromis medical porte taux + duree.
Sur GO Rafael (« oui fais cela »), ajout de [taux_pret] + [duree_pret] au
modele dentaire, calques exactement sur le medical (« …au taux maximum de
[taux_pret] l'an hors assurance, amortissable sur une periode minimum de
[duree_pret], »). Le generateur (put_opt) et l'UI (taux/duree collectes au
compromis) etaient deja prets : champs vides -> zone a completer, jamais
bloquant. Confirmation Rafael 2026-06-11 : le descriptif libre du local
(2.5) concerne l'acte de cession d'un cabinet medical (token [superficie_local]).

Tests : +2 (taux rempli rendu + taux vide non bloquant). Suite : 419 verts.
Journal de decisions : SELARL-PRET-1 + precision SELARL-LOC-1.

Co-Authored-By: Claude Fable 5 <noreply@anthropic.com>
</commit_message>
<xml_diff>
--- a/project/source_documents/lot_03/Compromis de cession d_un cabinet dentaire.docx
+++ b/project/source_documents/lot_03/Compromis de cession d_un cabinet dentaire.docx
@@ -6528,7 +6528,7 @@
           <w:vertAlign w:val="baseline"/>
           <w:rtl w:val="0"/>
         </w:rPr>
-        <w:t xml:space="preserve"> </w:t>
+        <w:t xml:space="preserve"> [taux_pret]</w:t>
       </w:r>
       <w:sdt>
         <w:sdtPr>
@@ -6639,7 +6639,7 @@
           <w:vertAlign w:val="baseline"/>
           <w:rtl w:val="0"/>
         </w:rPr>
-        <w:t xml:space="preserve"> l’an hors assurance</w:t>
+        <w:t xml:space="preserve"> l’an hors assurance, amortissable sur une période minimum de [duree_pret],</w:t>
       </w:r>
       <w:sdt>
         <w:sdtPr>

</xml_diff>

<commit_message>
fix(compromis): modeles source — titre « DATE » fixe (§9.6) + table CA 3 annees distinctes (§9.4)
§9.6 : le titre « DATE PREVUE DE REALISATION » portait par erreur le token
[date_origine_propriete] a la place du mot « DATE » (rendait une date) — dentaire
+ medical. Token retire du TITRE, conserve au CORPS (origine de propriete).
§9.4 : la table chiffre d'affaires dupliquait [chiffre_affaires_1] et omettait
[chiffre_affaires_2] -> l'annee 2 ne s'affichait jamais. Tokens _1/_2/_3 distincts.
Edits de modeles source uniquement ; generateur/formulaire fournissaient deja CA 1/2/3.
Test ajoute : titre fixe + 3 CA distincts.

Co-Authored-By: Claude Opus 4.8 (1M context) <noreply@anthropic.com>
</commit_message>
<xml_diff>
--- a/project/source_documents/lot_03/Compromis de cession d_un cabinet dentaire.docx
+++ b/project/source_documents/lot_03/Compromis de cession d_un cabinet dentaire.docx
@@ -3483,7 +3483,7 @@
                 <w:szCs w:val="20"/>
                 <w:rtl w:val="0"/>
               </w:rPr>
-              <w:t xml:space="preserve">[chiffre_affaires_1] €</w:t>
+              <w:t>[chiffre_affaires_2] €</w:t>
             </w:r>
           </w:p>
         </w:tc>
@@ -5356,7 +5356,7 @@
           <w:u w:val="single"/>
           <w:rtl w:val="0"/>
         </w:rPr>
-        <w:t xml:space="preserve">[date_origine_propriete] PREVUE DE REALISATION</w:t>
+        <w:t>DATE PREVUE DE REALISATION</w:t>
       </w:r>
     </w:p>
     <w:p>

</xml_diff>